<commit_message>
Fix urine sediment extraction column shift, reduksi alias, and dynamic PP test template
</commit_message>
<xml_diff>
--- a/NEW TEMPLATE SAT URIN.docx
+++ b/NEW TEMPLATE SAT URIN.docx
@@ -64,20 +64,6 @@
           <w:sz w:val="21"/>
           <w:szCs w:val="21"/>
         </w:rPr>
-      </w:r>
-      <w:r>
-        <w:rPr>
-          <w:rFonts w:ascii="Times New Roman" w:hAnsi="Times New Roman" w:cs="Times New Roman"/>
-          <w:sz w:val="21"/>
-          <w:szCs w:val="21"/>
-        </w:rPr>
-      </w:r>
-      <w:r>
-        <w:rPr>
-          <w:rFonts w:ascii="Times New Roman" w:hAnsi="Times New Roman" w:cs="Times New Roman"/>
-          <w:sz w:val="21"/>
-          <w:szCs w:val="21"/>
-        </w:rPr>
         <w:fldChar w:fldCharType="separate"/>
       </w:r>
       <w:r>
@@ -216,33 +202,15 @@
           <w:szCs w:val="21"/>
         </w:rPr>
         <w:tab/>
-        <w:t xml:space="preserve">            </w:t>
-      </w:r>
-      <w:proofErr w:type="gramStart"/>
+        <w:t xml:space="preserve">              </w:t>
+      </w:r>
       <w:r>
         <w:rPr>
           <w:rFonts w:ascii="Times New Roman" w:hAnsi="Times New Roman" w:cs="Times New Roman"/>
           <w:sz w:val="21"/>
           <w:szCs w:val="21"/>
         </w:rPr>
-        <w:t xml:space="preserve">  </w:t>
-      </w:r>
-      <w:r>
-        <w:rPr>
-          <w:rFonts w:ascii="Times New Roman" w:hAnsi="Times New Roman" w:cs="Times New Roman"/>
-          <w:sz w:val="21"/>
-          <w:szCs w:val="21"/>
-        </w:rPr>
-        <w:t>:</w:t>
-      </w:r>
-      <w:proofErr w:type="gramEnd"/>
-      <w:r>
-        <w:rPr>
-          <w:rFonts w:ascii="Times New Roman" w:hAnsi="Times New Roman" w:cs="Times New Roman"/>
-          <w:sz w:val="21"/>
-          <w:szCs w:val="21"/>
-        </w:rPr>
-        <w:t xml:space="preserve"> </w:t>
+        <w:t xml:space="preserve">: </w:t>
       </w:r>
       <w:r>
         <w:rPr>
@@ -520,7 +488,6 @@
         </w:rPr>
         <w:tab/>
       </w:r>
-      <w:proofErr w:type="spellStart"/>
       <w:r>
         <w:rPr>
           <w:rFonts w:ascii="Cambria" w:hAnsi="Cambria"/>
@@ -528,57 +495,7 @@
           <w:sz w:val="20"/>
           <w:szCs w:val="20"/>
         </w:rPr>
-        <w:t>Penanggung</w:t>
-      </w:r>
-      <w:proofErr w:type="spellEnd"/>
-      <w:r>
-        <w:rPr>
-          <w:rFonts w:ascii="Cambria" w:hAnsi="Cambria"/>
-          <w:i/>
-          <w:sz w:val="20"/>
-          <w:szCs w:val="20"/>
-        </w:rPr>
-        <w:t xml:space="preserve"> </w:t>
-      </w:r>
-      <w:proofErr w:type="gramStart"/>
-      <w:r>
-        <w:rPr>
-          <w:rFonts w:ascii="Cambria" w:hAnsi="Cambria"/>
-          <w:i/>
-          <w:sz w:val="20"/>
-          <w:szCs w:val="20"/>
-        </w:rPr>
-        <w:t>Jawab :</w:t>
-      </w:r>
-      <w:proofErr w:type="gramEnd"/>
-      <w:r>
-        <w:rPr>
-          <w:rFonts w:ascii="Cambria" w:hAnsi="Cambria"/>
-          <w:i/>
-          <w:sz w:val="20"/>
-          <w:szCs w:val="20"/>
-        </w:rPr>
-        <w:t xml:space="preserve"> dr. </w:t>
-      </w:r>
-      <w:proofErr w:type="spellStart"/>
-      <w:r>
-        <w:rPr>
-          <w:rFonts w:ascii="Cambria" w:hAnsi="Cambria"/>
-          <w:i/>
-          <w:sz w:val="20"/>
-          <w:szCs w:val="20"/>
-        </w:rPr>
-        <w:t>Raksi</w:t>
-      </w:r>
-      <w:proofErr w:type="spellEnd"/>
-      <w:r>
-        <w:rPr>
-          <w:rFonts w:ascii="Cambria" w:hAnsi="Cambria"/>
-          <w:i/>
-          <w:sz w:val="20"/>
-          <w:szCs w:val="20"/>
-        </w:rPr>
-        <w:t xml:space="preserve"> Pranindira</w:t>
+        <w:t>Penanggung Jawab : dr. Raksi Pranindira</w:t>
       </w:r>
       <w:r>
         <w:rPr>
@@ -931,15 +848,6 @@
                 <w:sz w:val="19"/>
                 <w:szCs w:val="19"/>
               </w:rPr>
-            </w:r>
-            <w:r>
-              <w:rPr>
-                <w:rFonts w:ascii="Arial" w:eastAsia="Times New Roman" w:hAnsi="Arial" w:cs="Arial"/>
-                <w:noProof/>
-                <w:color w:val="000000"/>
-                <w:sz w:val="19"/>
-                <w:szCs w:val="19"/>
-              </w:rPr>
               <w:fldChar w:fldCharType="separate"/>
             </w:r>
             <w:r>
@@ -1100,7 +1008,6 @@
                 <w:szCs w:val="20"/>
               </w:rPr>
             </w:pPr>
-            <w:proofErr w:type="spellStart"/>
             <w:r>
               <w:rPr>
                 <w:rFonts w:ascii="Arial" w:eastAsia="Times New Roman" w:hAnsi="Arial" w:cs="Arial"/>
@@ -1110,7 +1017,6 @@
               </w:rPr>
               <w:t>Kejernihan</w:t>
             </w:r>
-            <w:proofErr w:type="spellEnd"/>
           </w:p>
         </w:tc>
         <w:tc>
@@ -1564,14 +1470,6 @@
                 <w:sz w:val="19"/>
                 <w:szCs w:val="19"/>
               </w:rPr>
-            </w:r>
-            <w:r>
-              <w:rPr>
-                <w:rFonts w:ascii="Arial" w:eastAsia="Times New Roman" w:hAnsi="Arial" w:cs="Arial"/>
-                <w:color w:val="000000"/>
-                <w:sz w:val="19"/>
-                <w:szCs w:val="19"/>
-              </w:rPr>
               <w:fldChar w:fldCharType="separate"/>
             </w:r>
             <w:r>
@@ -1724,14 +1622,6 @@
                 <w:sz w:val="19"/>
                 <w:szCs w:val="19"/>
               </w:rPr>
-            </w:r>
-            <w:r>
-              <w:rPr>
-                <w:rFonts w:ascii="Arial" w:eastAsia="Times New Roman" w:hAnsi="Arial" w:cs="Arial"/>
-                <w:color w:val="000000"/>
-                <w:sz w:val="19"/>
-                <w:szCs w:val="19"/>
-              </w:rPr>
               <w:fldChar w:fldCharType="separate"/>
             </w:r>
             <w:r>
@@ -1829,7 +1719,6 @@
                 <w:szCs w:val="20"/>
               </w:rPr>
             </w:pPr>
-            <w:proofErr w:type="spellStart"/>
             <w:r>
               <w:rPr>
                 <w:rFonts w:ascii="Arial" w:eastAsia="Times New Roman" w:hAnsi="Arial" w:cs="Arial"/>
@@ -1839,7 +1728,6 @@
               </w:rPr>
               <w:t>Lekosit</w:t>
             </w:r>
-            <w:proofErr w:type="spellEnd"/>
           </w:p>
         </w:tc>
         <w:tc>
@@ -1987,7 +1875,6 @@
                 <w:szCs w:val="20"/>
               </w:rPr>
             </w:pPr>
-            <w:proofErr w:type="spellStart"/>
             <w:r>
               <w:rPr>
                 <w:rFonts w:ascii="Arial" w:eastAsia="Times New Roman" w:hAnsi="Arial" w:cs="Arial"/>
@@ -1997,7 +1884,6 @@
               </w:rPr>
               <w:t>Nitrit</w:t>
             </w:r>
-            <w:proofErr w:type="spellEnd"/>
           </w:p>
         </w:tc>
         <w:tc>
@@ -2145,7 +2031,6 @@
                 <w:szCs w:val="20"/>
               </w:rPr>
             </w:pPr>
-            <w:proofErr w:type="spellStart"/>
             <w:r>
               <w:rPr>
                 <w:rFonts w:ascii="Arial" w:eastAsia="Times New Roman" w:hAnsi="Arial" w:cs="Arial"/>
@@ -2155,7 +2040,6 @@
               </w:rPr>
               <w:t>Glukosa</w:t>
             </w:r>
-            <w:proofErr w:type="spellEnd"/>
           </w:p>
         </w:tc>
         <w:tc>
@@ -2194,22 +2078,6 @@
                 <w:szCs w:val="19"/>
               </w:rPr>
               <w:instrText xml:space="preserve"> MERGEFIELD GLUKOSA </w:instrText>
-            </w:r>
-            <w:r>
-              <w:rPr>
-                <w:rFonts w:ascii="Arial" w:eastAsia="Times New Roman" w:hAnsi="Arial" w:cs="Arial"/>
-                <w:color w:val="000000"/>
-                <w:sz w:val="19"/>
-                <w:szCs w:val="19"/>
-              </w:rPr>
-            </w:r>
-            <w:r>
-              <w:rPr>
-                <w:rFonts w:ascii="Arial" w:eastAsia="Times New Roman" w:hAnsi="Arial" w:cs="Arial"/>
-                <w:color w:val="000000"/>
-                <w:sz w:val="19"/>
-                <w:szCs w:val="19"/>
-              </w:rPr>
             </w:r>
             <w:r>
               <w:rPr>
@@ -3214,7 +3082,6 @@
                 <w:szCs w:val="20"/>
               </w:rPr>
             </w:pPr>
-            <w:proofErr w:type="spellStart"/>
             <w:r>
               <w:rPr>
                 <w:rFonts w:ascii="Arial" w:eastAsia="Times New Roman" w:hAnsi="Arial" w:cs="Arial"/>
@@ -3224,7 +3091,6 @@
               </w:rPr>
               <w:t>Epitel</w:t>
             </w:r>
-            <w:proofErr w:type="spellEnd"/>
           </w:p>
         </w:tc>
         <w:tc>
@@ -3368,7 +3234,6 @@
                 <w:szCs w:val="20"/>
               </w:rPr>
             </w:pPr>
-            <w:proofErr w:type="spellStart"/>
             <w:r>
               <w:rPr>
                 <w:rFonts w:ascii="Arial" w:eastAsia="Times New Roman" w:hAnsi="Arial" w:cs="Arial"/>
@@ -3378,7 +3243,6 @@
               </w:rPr>
               <w:t>Lekosit</w:t>
             </w:r>
-            <w:proofErr w:type="spellEnd"/>
           </w:p>
         </w:tc>
         <w:tc>
@@ -3522,7 +3386,6 @@
                 <w:szCs w:val="20"/>
               </w:rPr>
             </w:pPr>
-            <w:proofErr w:type="spellStart"/>
             <w:r>
               <w:rPr>
                 <w:rFonts w:ascii="Arial" w:eastAsia="Times New Roman" w:hAnsi="Arial" w:cs="Arial"/>
@@ -3532,7 +3395,6 @@
               </w:rPr>
               <w:t>Eritrosit</w:t>
             </w:r>
-            <w:proofErr w:type="spellEnd"/>
           </w:p>
         </w:tc>
         <w:tc>
@@ -3814,90 +3676,32 @@
             <w:gridSpan w:val="2"/>
             <w:tcBorders>
               <w:left w:val="single" w:sz="4" w:space="0" w:color="auto"/>
-              <w:bottom w:val="single" w:sz="4" w:space="0" w:color="auto"/>
-            </w:tcBorders>
-            <w:vAlign w:val="center"/>
-          </w:tcPr>
-          <w:p>
-            <w:pPr>
-              <w:rPr>
-                <w:rFonts w:ascii="Arial" w:eastAsia="Times New Roman" w:hAnsi="Arial" w:cs="Arial"/>
-                <w:color w:val="000000"/>
-                <w:sz w:val="18"/>
-                <w:szCs w:val="18"/>
-              </w:rPr>
-            </w:pPr>
-            <w:proofErr w:type="spellStart"/>
-            <w:r>
-              <w:rPr>
-                <w:rFonts w:ascii="Arial" w:eastAsia="Times New Roman" w:hAnsi="Arial" w:cs="Arial"/>
-                <w:color w:val="000000"/>
-                <w:sz w:val="18"/>
-                <w:szCs w:val="18"/>
+            </w:tcBorders>
+            <w:vAlign w:val="center"/>
+          </w:tcPr>
+          <w:p>
+            <w:pPr>
+              <w:rPr>
+                <w:rFonts w:ascii="Arial" w:eastAsia="Times New Roman" w:hAnsi="Arial" w:cs="Arial"/>
+                <w:color w:val="000000"/>
+                <w:sz w:val="20"/>
+                <w:szCs w:val="20"/>
+              </w:rPr>
+            </w:pPr>
+            <w:r>
+              <w:rPr>
+                <w:rFonts w:ascii="Arial" w:eastAsia="Times New Roman" w:hAnsi="Arial" w:cs="Arial"/>
+                <w:color w:val="000000"/>
+                <w:sz w:val="20"/>
+                <w:szCs w:val="20"/>
               </w:rPr>
               <w:t>Bakteri</w:t>
             </w:r>
-            <w:proofErr w:type="spellEnd"/>
-          </w:p>
-          <w:p>
-            <w:pPr>
-              <w:rPr>
-                <w:rFonts w:eastAsia="Times New Roman" w:cstheme="minorHAnsi"/>
-                <w:color w:val="000000"/>
-                <w:sz w:val="18"/>
-                <w:szCs w:val="18"/>
-              </w:rPr>
-            </w:pPr>
-          </w:p>
-          <w:p>
-            <w:pPr>
-              <w:rPr>
-                <w:rFonts w:ascii="Times New Roman" w:eastAsia="Times New Roman" w:hAnsi="Times New Roman" w:cs="Times New Roman"/>
-                <w:b/>
-                <w:color w:val="000000"/>
-                <w:sz w:val="18"/>
-                <w:szCs w:val="18"/>
-              </w:rPr>
-            </w:pPr>
-          </w:p>
-          <w:p>
-            <w:pPr>
-              <w:rPr>
-                <w:rFonts w:ascii="Times New Roman" w:eastAsia="Times New Roman" w:hAnsi="Times New Roman" w:cs="Times New Roman"/>
-                <w:b/>
-                <w:color w:val="000000"/>
-                <w:sz w:val="18"/>
-                <w:szCs w:val="18"/>
-              </w:rPr>
-            </w:pPr>
-            <w:r>
-              <w:rPr>
-                <w:rFonts w:ascii="Times New Roman" w:eastAsia="Times New Roman" w:hAnsi="Times New Roman" w:cs="Times New Roman"/>
-                <w:b/>
-                <w:color w:val="000000"/>
-                <w:sz w:val="18"/>
-                <w:szCs w:val="18"/>
-              </w:rPr>
-              <w:t xml:space="preserve">                                                                                                                                                                                                                                                                                                                                                                                                                                                                                                                                                                                                                                                                                                                                                                                                                                                                                                                                                                                                                                                                                                                                                                                                                                                                                                                                                                                                                                                                                                                                                                                                                                                                                                                                                                                                                                                                                                                                                                                                                                                                                                                          </w:t>
-            </w:r>
-          </w:p>
-          <w:p>
-            <w:pPr>
-              <w:rPr>
-                <w:rFonts w:eastAsia="Times New Roman" w:cstheme="minorHAnsi"/>
-                <w:color w:val="000000"/>
-                <w:sz w:val="18"/>
-                <w:szCs w:val="18"/>
-              </w:rPr>
-            </w:pPr>
           </w:p>
         </w:tc>
         <w:tc>
           <w:tcPr>
             <w:tcW w:w="1688" w:type="dxa"/>
-            <w:tcBorders>
-              <w:bottom w:val="single" w:sz="4" w:space="0" w:color="auto"/>
-            </w:tcBorders>
             <w:vAlign w:val="center"/>
           </w:tcPr>
           <w:p>
@@ -3908,17 +3712,17 @@
                 <w:rFonts w:ascii="Arial" w:eastAsia="Times New Roman" w:hAnsi="Arial" w:cs="Arial"/>
                 <w:noProof/>
                 <w:color w:val="000000"/>
-                <w:sz w:val="18"/>
-                <w:szCs w:val="18"/>
-              </w:rPr>
-            </w:pPr>
-            <w:r>
-              <w:rPr>
-                <w:rFonts w:ascii="Arial" w:eastAsia="Times New Roman" w:hAnsi="Arial" w:cs="Arial"/>
-                <w:noProof/>
-                <w:color w:val="000000"/>
-                <w:sz w:val="18"/>
-                <w:szCs w:val="18"/>
+                <w:sz w:val="19"/>
+                <w:szCs w:val="19"/>
+              </w:rPr>
+            </w:pPr>
+            <w:r>
+              <w:rPr>
+                <w:rFonts w:ascii="Arial" w:eastAsia="Times New Roman" w:hAnsi="Arial" w:cs="Arial"/>
+                <w:noProof/>
+                <w:color w:val="000000"/>
+                <w:sz w:val="19"/>
+                <w:szCs w:val="19"/>
               </w:rPr>
               <w:fldChar w:fldCharType="begin"/>
             </w:r>
@@ -3927,18 +3731,38 @@
                 <w:rFonts w:ascii="Arial" w:eastAsia="Times New Roman" w:hAnsi="Arial" w:cs="Arial"/>
                 <w:noProof/>
                 <w:color w:val="000000"/>
-                <w:sz w:val="18"/>
-                <w:szCs w:val="18"/>
-              </w:rPr>
-              <w:instrText xml:space="preserve"> MERGEFIELD BAKTERI </w:instrText>
-            </w:r>
-            <w:r>
-              <w:rPr>
-                <w:rFonts w:ascii="Arial" w:eastAsia="Times New Roman" w:hAnsi="Arial" w:cs="Arial"/>
-                <w:noProof/>
-                <w:color w:val="000000"/>
-                <w:sz w:val="18"/>
-                <w:szCs w:val="18"/>
+                <w:sz w:val="19"/>
+                <w:szCs w:val="19"/>
+              </w:rPr>
+              <w:instrText xml:space="preserve"> MER</w:instrText>
+            </w:r>
+            <w:r>
+              <w:rPr>
+                <w:rFonts w:ascii="Arial" w:eastAsia="Times New Roman" w:hAnsi="Arial" w:cs="Arial"/>
+                <w:noProof/>
+                <w:color w:val="000000"/>
+                <w:sz w:val="19"/>
+                <w:szCs w:val="19"/>
+              </w:rPr>
+              <w:instrText>GEFIELD BAKTERI</w:instrText>
+            </w:r>
+            <w:r>
+              <w:rPr>
+                <w:rFonts w:ascii="Arial" w:eastAsia="Times New Roman" w:hAnsi="Arial" w:cs="Arial"/>
+                <w:noProof/>
+                <w:color w:val="000000"/>
+                <w:sz w:val="19"/>
+                <w:szCs w:val="19"/>
+              </w:rPr>
+              <w:instrText xml:space="preserve"> </w:instrText>
+            </w:r>
+            <w:r>
+              <w:rPr>
+                <w:rFonts w:ascii="Arial" w:eastAsia="Times New Roman" w:hAnsi="Arial" w:cs="Arial"/>
+                <w:noProof/>
+                <w:color w:val="000000"/>
+                <w:sz w:val="19"/>
+                <w:szCs w:val="19"/>
               </w:rPr>
               <w:fldChar w:fldCharType="separate"/>
             </w:r>
@@ -3947,147 +3771,314 @@
                 <w:rFonts w:ascii="Arial" w:eastAsia="Times New Roman" w:hAnsi="Arial" w:cs="Arial"/>
                 <w:noProof/>
                 <w:color w:val="000000"/>
-                <w:sz w:val="18"/>
-                <w:szCs w:val="18"/>
-              </w:rPr>
-              <w:t>«BAKTERI»</w:t>
-            </w:r>
-            <w:r>
-              <w:rPr>
-                <w:rFonts w:ascii="Arial" w:eastAsia="Times New Roman" w:hAnsi="Arial" w:cs="Arial"/>
-                <w:noProof/>
-                <w:color w:val="000000"/>
-                <w:sz w:val="18"/>
-                <w:szCs w:val="18"/>
+                <w:sz w:val="19"/>
+                <w:szCs w:val="19"/>
               </w:rPr>
               <w:fldChar w:fldCharType="end"/>
             </w:r>
-          </w:p>
-          <w:p>
-            <w:pPr>
-              <w:ind w:left="-279"/>
-              <w:jc w:val="center"/>
-              <w:rPr>
-                <w:rFonts w:eastAsia="Times New Roman" w:cstheme="minorHAnsi"/>
-                <w:b/>
-                <w:noProof/>
-                <w:color w:val="000000"/>
-                <w:sz w:val="18"/>
-                <w:szCs w:val="18"/>
-              </w:rPr>
-            </w:pPr>
-          </w:p>
-          <w:p>
-            <w:pPr>
-              <w:ind w:left="-279"/>
-              <w:jc w:val="center"/>
-              <w:rPr>
-                <w:rFonts w:ascii="Arial" w:eastAsia="Times New Roman" w:hAnsi="Arial" w:cs="Arial"/>
-                <w:b/>
-                <w:noProof/>
-                <w:color w:val="000000"/>
-                <w:sz w:val="18"/>
-                <w:szCs w:val="18"/>
-              </w:rPr>
-            </w:pPr>
-          </w:p>
-          <w:p>
-            <w:pPr>
-              <w:ind w:left="-279"/>
-              <w:jc w:val="center"/>
-              <w:rPr>
-                <w:rFonts w:ascii="Arial" w:eastAsia="Times New Roman" w:hAnsi="Arial" w:cs="Arial"/>
-                <w:noProof/>
-                <w:color w:val="000000"/>
-                <w:sz w:val="18"/>
-                <w:szCs w:val="18"/>
-              </w:rPr>
-            </w:pPr>
-          </w:p>
-          <w:p>
-            <w:pPr>
-              <w:ind w:left="-279"/>
-              <w:jc w:val="center"/>
-              <w:rPr>
-                <w:rFonts w:eastAsia="Times New Roman" w:cstheme="minorHAnsi"/>
-                <w:b/>
-                <w:color w:val="000000"/>
-                <w:sz w:val="18"/>
-                <w:szCs w:val="18"/>
-              </w:rPr>
-            </w:pPr>
           </w:p>
         </w:tc>
         <w:tc>
           <w:tcPr>
             <w:tcW w:w="2729" w:type="dxa"/>
             <w:gridSpan w:val="3"/>
-            <w:tcBorders>
+            <w:vAlign w:val="center"/>
+          </w:tcPr>
+          <w:p>
+            <w:pPr>
+              <w:jc w:val="center"/>
+              <w:rPr>
+                <w:rFonts w:ascii="Arial" w:eastAsia="Times New Roman" w:hAnsi="Arial" w:cs="Arial"/>
+                <w:color w:val="000000"/>
+                <w:sz w:val="20"/>
+                <w:szCs w:val="20"/>
+              </w:rPr>
+            </w:pPr>
+          </w:p>
+        </w:tc>
+        <w:tc>
+          <w:tcPr>
+            <w:tcW w:w="1852" w:type="dxa"/>
+            <w:tcBorders>
+              <w:right w:val="single" w:sz="4" w:space="0" w:color="auto"/>
+            </w:tcBorders>
+            <w:vAlign w:val="center"/>
+          </w:tcPr>
+          <w:p>
+            <w:pPr>
+              <w:ind w:left="-279"/>
+              <w:jc w:val="center"/>
+              <w:rPr>
+                <w:rFonts w:eastAsia="Times New Roman" w:cstheme="minorHAnsi"/>
+                <w:color w:val="000000"/>
+                <w:sz w:val="20"/>
+                <w:szCs w:val="20"/>
+              </w:rPr>
+            </w:pPr>
+          </w:p>
+        </w:tc>
+      </w:tr>
+      <w:tr>
+        <w:trPr>
+          <w:trHeight w:val="985"/>
+        </w:trPr>
+        <w:tc>
+          <w:tcPr>
+            <w:tcW w:w="2703" w:type="dxa"/>
+            <w:gridSpan w:val="2"/>
+            <w:tcBorders>
+              <w:left w:val="single" w:sz="4" w:space="0" w:color="auto"/>
+            </w:tcBorders>
+            <w:vAlign w:val="center"/>
+          </w:tcPr>
+          <w:p>
+            <w:pPr>
+              <w:rPr>
+                <w:rFonts w:ascii="Arial" w:eastAsia="Times New Roman" w:hAnsi="Arial" w:cs="Arial"/>
+                <w:b/>
+                <w:bCs/>
+                <w:color w:val="000000"/>
+                <w:sz w:val="20"/>
+                <w:szCs w:val="20"/>
+              </w:rPr>
+            </w:pPr>
+            <w:r>
+              <w:rPr>
+                <w:rFonts w:ascii="Arial" w:eastAsia="Times New Roman" w:hAnsi="Arial" w:cs="Arial"/>
+                <w:b/>
+                <w:bCs/>
+                <w:color w:val="000000"/>
+                <w:sz w:val="20"/>
+                <w:szCs w:val="20"/>
+              </w:rPr>
+              <w:t>PP Test</w:t>
+            </w:r>
+          </w:p>
+        </w:tc>
+        <w:tc>
+          <w:tcPr>
+            <w:tcW w:w="1688" w:type="dxa"/>
+            <w:vAlign w:val="center"/>
+          </w:tcPr>
+          <w:p>
+            <w:pPr>
+              <w:ind w:left="-126"/>
+              <w:jc w:val="center"/>
+              <w:rPr>
+                <w:rFonts w:ascii="Arial" w:eastAsia="Times New Roman" w:hAnsi="Arial" w:cs="Arial"/>
+                <w:b/>
+                <w:bCs/>
+                <w:noProof/>
+                <w:color w:val="000000"/>
+                <w:sz w:val="19"/>
+                <w:szCs w:val="19"/>
+              </w:rPr>
+            </w:pPr>
+            <w:r>
+              <w:rPr>
+                <w:rFonts w:ascii="Arial" w:eastAsia="Times New Roman" w:hAnsi="Arial" w:cs="Arial"/>
+                <w:b/>
+                <w:bCs/>
+                <w:noProof/>
+                <w:color w:val="000000"/>
+                <w:sz w:val="19"/>
+                <w:szCs w:val="19"/>
+              </w:rPr>
+              <w:fldChar w:fldCharType="begin"/>
+            </w:r>
+            <w:r>
+              <w:rPr>
+                <w:rFonts w:ascii="Arial" w:eastAsia="Times New Roman" w:hAnsi="Arial" w:cs="Arial"/>
+                <w:b/>
+                <w:bCs/>
+                <w:noProof/>
+                <w:color w:val="000000"/>
+                <w:sz w:val="19"/>
+                <w:szCs w:val="19"/>
+              </w:rPr>
+              <w:instrText xml:space="preserve"> MERG</w:instrText>
+            </w:r>
+            <w:r>
+              <w:rPr>
+                <w:rFonts w:ascii="Arial" w:eastAsia="Times New Roman" w:hAnsi="Arial" w:cs="Arial"/>
+                <w:b/>
+                <w:bCs/>
+                <w:noProof/>
+                <w:color w:val="000000"/>
+                <w:sz w:val="19"/>
+                <w:szCs w:val="19"/>
+              </w:rPr>
+              <w:instrText>EFIELD</w:instrText>
+            </w:r>
+          </w:p>
+          <w:p>
+            <w:pPr>
+              <w:ind w:left="-126"/>
+              <w:jc w:val="center"/>
+              <w:rPr>
+                <w:rFonts w:ascii="Arial" w:eastAsia="Times New Roman" w:hAnsi="Arial" w:cs="Arial"/>
+                <w:b/>
+                <w:bCs/>
+                <w:noProof/>
+                <w:color w:val="000000"/>
+                <w:sz w:val="19"/>
+                <w:szCs w:val="19"/>
+              </w:rPr>
+            </w:pPr>
+            <w:r>
+              <w:rPr>
+                <w:rFonts w:ascii="Arial" w:eastAsia="Times New Roman" w:hAnsi="Arial" w:cs="Arial"/>
+                <w:b/>
+                <w:bCs/>
+                <w:noProof/>
+                <w:color w:val="000000"/>
+                <w:sz w:val="19"/>
+                <w:szCs w:val="19"/>
+              </w:rPr>
+              <w:instrText>PP TEST</w:instrText>
+            </w:r>
+            <w:r>
+              <w:rPr>
+                <w:rFonts w:ascii="Arial" w:eastAsia="Times New Roman" w:hAnsi="Arial" w:cs="Arial"/>
+                <w:b/>
+                <w:bCs/>
+                <w:noProof/>
+                <w:color w:val="000000"/>
+                <w:sz w:val="19"/>
+                <w:szCs w:val="19"/>
+              </w:rPr>
+              <w:instrText xml:space="preserve"> </w:instrText>
+            </w:r>
+            <w:r>
+              <w:rPr>
+                <w:rFonts w:ascii="Arial" w:eastAsia="Times New Roman" w:hAnsi="Arial" w:cs="Arial"/>
+                <w:b/>
+                <w:bCs/>
+                <w:noProof/>
+                <w:color w:val="000000"/>
+                <w:sz w:val="19"/>
+                <w:szCs w:val="19"/>
+              </w:rPr>
+              <w:fldChar w:fldCharType="separate"/>
+            </w:r>
+            <w:r>
+              <w:rPr>
+                <w:rFonts w:ascii="Arial" w:eastAsia="Times New Roman" w:hAnsi="Arial" w:cs="Arial"/>
+                <w:b/>
+                <w:bCs/>
+                <w:noProof/>
+                <w:color w:val="000000"/>
+                <w:sz w:val="19"/>
+                <w:szCs w:val="19"/>
+              </w:rPr>
+              <w:fldChar w:fldCharType="end"/>
+            </w:r>
+          </w:p>
+        </w:tc>
+        <w:tc>
+          <w:tcPr>
+            <w:tcW w:w="2729" w:type="dxa"/>
+            <w:gridSpan w:val="3"/>
+            <w:vAlign w:val="center"/>
+          </w:tcPr>
+          <w:p>
+            <w:pPr>
+              <w:jc w:val="center"/>
+              <w:rPr>
+                <w:rFonts w:ascii="Arial" w:eastAsia="Times New Roman" w:hAnsi="Arial" w:cs="Arial"/>
+                <w:color w:val="000000"/>
+                <w:sz w:val="20"/>
+                <w:szCs w:val="20"/>
+              </w:rPr>
+            </w:pPr>
+          </w:p>
+        </w:tc>
+        <w:tc>
+          <w:tcPr>
+            <w:tcW w:w="1852" w:type="dxa"/>
+            <w:tcBorders>
+              <w:right w:val="single" w:sz="4" w:space="0" w:color="auto"/>
+            </w:tcBorders>
+            <w:vAlign w:val="center"/>
+          </w:tcPr>
+          <w:p>
+            <w:pPr>
+              <w:ind w:left="-279"/>
+              <w:jc w:val="center"/>
+              <w:rPr>
+                <w:rFonts w:eastAsia="Times New Roman" w:cstheme="minorHAnsi"/>
+                <w:color w:val="000000"/>
+                <w:sz w:val="20"/>
+                <w:szCs w:val="20"/>
+              </w:rPr>
+            </w:pPr>
+          </w:p>
+        </w:tc>
+      </w:tr>
+      <w:tr>
+        <w:trPr>
+          <w:trHeight w:val="223"/>
+        </w:trPr>
+        <w:tc>
+          <w:tcPr>
+            <w:tcW w:w="2703" w:type="dxa"/>
+            <w:gridSpan w:val="2"/>
+            <w:tcBorders>
+              <w:left w:val="single" w:sz="4" w:space="0" w:color="auto"/>
               <w:bottom w:val="single" w:sz="4" w:space="0" w:color="auto"/>
             </w:tcBorders>
             <w:vAlign w:val="center"/>
           </w:tcPr>
           <w:p>
             <w:pPr>
-              <w:jc w:val="center"/>
-              <w:rPr>
-                <w:rFonts w:ascii="Arial" w:eastAsia="Times New Roman" w:hAnsi="Arial" w:cs="Arial"/>
-                <w:color w:val="000000"/>
-                <w:sz w:val="20"/>
-                <w:szCs w:val="20"/>
-              </w:rPr>
-            </w:pPr>
-            <w:r>
-              <w:rPr>
-                <w:rFonts w:ascii="Arial" w:eastAsia="Times New Roman" w:hAnsi="Arial" w:cs="Arial"/>
-                <w:color w:val="000000"/>
-                <w:sz w:val="20"/>
-                <w:szCs w:val="20"/>
-              </w:rPr>
-              <w:t>/LPB</w:t>
-            </w:r>
-          </w:p>
-          <w:p>
-            <w:pPr>
-              <w:jc w:val="center"/>
-              <w:rPr>
-                <w:rFonts w:eastAsia="Times New Roman" w:cstheme="minorHAnsi"/>
-                <w:color w:val="000000"/>
-                <w:sz w:val="18"/>
-                <w:szCs w:val="18"/>
-              </w:rPr>
-            </w:pPr>
-          </w:p>
-          <w:p>
-            <w:pPr>
-              <w:jc w:val="center"/>
-              <w:rPr>
-                <w:rFonts w:eastAsia="Times New Roman" w:cstheme="minorHAnsi"/>
-                <w:color w:val="000000"/>
-                <w:sz w:val="18"/>
-                <w:szCs w:val="18"/>
-              </w:rPr>
-            </w:pPr>
-          </w:p>
-          <w:p>
-            <w:pPr>
-              <w:jc w:val="center"/>
-              <w:rPr>
-                <w:rFonts w:eastAsia="Times New Roman" w:cstheme="minorHAnsi"/>
-                <w:color w:val="000000"/>
-                <w:sz w:val="18"/>
-                <w:szCs w:val="18"/>
-              </w:rPr>
-            </w:pPr>
-          </w:p>
-          <w:p>
-            <w:pPr>
-              <w:jc w:val="center"/>
-              <w:rPr>
-                <w:rFonts w:eastAsia="Times New Roman" w:cstheme="minorHAnsi"/>
-                <w:color w:val="000000"/>
-                <w:sz w:val="18"/>
-                <w:szCs w:val="18"/>
+              <w:rPr>
+                <w:rFonts w:ascii="Arial" w:eastAsia="Times New Roman" w:hAnsi="Arial" w:cs="Arial"/>
+                <w:color w:val="000000"/>
+                <w:sz w:val="20"/>
+                <w:szCs w:val="20"/>
+              </w:rPr>
+            </w:pPr>
+          </w:p>
+        </w:tc>
+        <w:tc>
+          <w:tcPr>
+            <w:tcW w:w="1688" w:type="dxa"/>
+            <w:tcBorders>
+              <w:bottom w:val="single" w:sz="4" w:space="0" w:color="auto"/>
+            </w:tcBorders>
+            <w:vAlign w:val="center"/>
+          </w:tcPr>
+          <w:p>
+            <w:pPr>
+              <w:ind w:left="-126"/>
+              <w:jc w:val="center"/>
+              <w:rPr>
+                <w:rFonts w:ascii="Arial" w:eastAsia="Times New Roman" w:hAnsi="Arial" w:cs="Arial"/>
+                <w:noProof/>
+                <w:color w:val="000000"/>
+                <w:sz w:val="19"/>
+                <w:szCs w:val="19"/>
+              </w:rPr>
+            </w:pPr>
+          </w:p>
+        </w:tc>
+        <w:tc>
+          <w:tcPr>
+            <w:tcW w:w="2729" w:type="dxa"/>
+            <w:gridSpan w:val="3"/>
+            <w:tcBorders>
+              <w:bottom w:val="single" w:sz="4" w:space="0" w:color="auto"/>
+            </w:tcBorders>
+            <w:vAlign w:val="center"/>
+          </w:tcPr>
+          <w:p>
+            <w:pPr>
+              <w:jc w:val="center"/>
+              <w:rPr>
+                <w:rFonts w:ascii="Arial" w:eastAsia="Times New Roman" w:hAnsi="Arial" w:cs="Arial"/>
+                <w:color w:val="000000"/>
+                <w:sz w:val="20"/>
+                <w:szCs w:val="20"/>
               </w:rPr>
             </w:pPr>
           </w:p>
@@ -4108,8 +4099,8 @@
               <w:rPr>
                 <w:rFonts w:eastAsia="Times New Roman" w:cstheme="minorHAnsi"/>
                 <w:color w:val="000000"/>
-                <w:sz w:val="18"/>
-                <w:szCs w:val="18"/>
+                <w:sz w:val="20"/>
+                <w:szCs w:val="20"/>
               </w:rPr>
             </w:pPr>
           </w:p>
@@ -4121,6 +4112,7 @@
         <w:spacing w:after="0"/>
       </w:pPr>
       <w:r>
+        <w:lastRenderedPageBreak/>
         <w:t xml:space="preserve"> </w:t>
       </w:r>
     </w:p>
@@ -4134,23 +4126,13 @@
           <w:szCs w:val="21"/>
         </w:rPr>
       </w:pPr>
-      <w:proofErr w:type="spellStart"/>
       <w:r>
         <w:rPr>
           <w:rFonts w:ascii="Times New Roman" w:hAnsi="Times New Roman" w:cs="Times New Roman"/>
           <w:sz w:val="21"/>
           <w:szCs w:val="21"/>
         </w:rPr>
-        <w:t>Adiwerna</w:t>
-      </w:r>
-      <w:proofErr w:type="spellEnd"/>
-      <w:r>
-        <w:rPr>
-          <w:rFonts w:ascii="Times New Roman" w:hAnsi="Times New Roman" w:cs="Times New Roman"/>
-          <w:sz w:val="21"/>
-          <w:szCs w:val="21"/>
-        </w:rPr>
-        <w:t xml:space="preserve">, </w:t>
+        <w:t xml:space="preserve">Adiwerna, </w:t>
       </w:r>
       <w:r>
         <w:rPr>
@@ -4200,12 +4182,9 @@
         <w:ind w:left="5529" w:right="1989"/>
         <w:jc w:val="center"/>
       </w:pPr>
-      <w:proofErr w:type="spellStart"/>
-      <w:r>
-        <w:lastRenderedPageBreak/>
+      <w:r>
         <w:t>Pemeriksa</w:t>
       </w:r>
-      <w:proofErr w:type="spellEnd"/>
     </w:p>
     <w:p>
       <w:pPr>

</xml_diff>

<commit_message>
Support flexible rekap filenames (e.g. Rekap.xlsx) in mode_generate
</commit_message>
<xml_diff>
--- a/NEW TEMPLATE SAT URIN.docx
+++ b/NEW TEMPLATE SAT URIN.docx
@@ -69,12 +69,11 @@
       <w:r>
         <w:rPr>
           <w:rFonts w:ascii="Times New Roman" w:hAnsi="Times New Roman" w:cs="Times New Roman"/>
-          <w:b/>
-          <w:bCs/>
+          <w:noProof/>
           <w:sz w:val="21"/>
           <w:szCs w:val="21"/>
         </w:rPr>
-        <w:t>Error! Bookmark not defined.</w:t>
+        <w:t>«PUSKESMAS»</w:t>
       </w:r>
       <w:r>
         <w:rPr>
@@ -146,12 +145,11 @@
       <w:r>
         <w:rPr>
           <w:rFonts w:ascii="Times New Roman" w:hAnsi="Times New Roman" w:cs="Times New Roman"/>
-          <w:b/>
-          <w:bCs/>
+          <w:noProof/>
           <w:sz w:val="21"/>
           <w:szCs w:val="21"/>
         </w:rPr>
-        <w:t>Error! Bookmark not defined.</w:t>
+        <w:t>«TANGGAL_EXAM»</w:t>
       </w:r>
       <w:r>
         <w:rPr>
@@ -3774,6 +3772,16 @@
                 <w:sz w:val="19"/>
                 <w:szCs w:val="19"/>
               </w:rPr>
+              <w:t>«BAKTERI»</w:t>
+            </w:r>
+            <w:r>
+              <w:rPr>
+                <w:rFonts w:ascii="Arial" w:eastAsia="Times New Roman" w:hAnsi="Arial" w:cs="Arial"/>
+                <w:noProof/>
+                <w:color w:val="000000"/>
+                <w:sz w:val="19"/>
+                <w:szCs w:val="19"/>
+              </w:rPr>
               <w:fldChar w:fldCharType="end"/>
             </w:r>
           </w:p>
@@ -3960,6 +3968,18 @@
                 <w:szCs w:val="19"/>
               </w:rPr>
               <w:fldChar w:fldCharType="separate"/>
+            </w:r>
+            <w:r>
+              <w:rPr>
+                <w:rFonts w:ascii="Arial" w:eastAsia="Times New Roman" w:hAnsi="Arial" w:cs="Arial"/>
+                <w:b/>
+                <w:bCs/>
+                <w:noProof/>
+                <w:color w:val="000000"/>
+                <w:sz w:val="19"/>
+                <w:szCs w:val="19"/>
+              </w:rPr>
+              <w:t>«PP»</w:t>
             </w:r>
             <w:r>
               <w:rPr>
@@ -4161,12 +4181,11 @@
       <w:r>
         <w:rPr>
           <w:rFonts w:ascii="Times New Roman" w:hAnsi="Times New Roman" w:cs="Times New Roman"/>
-          <w:b/>
-          <w:bCs/>
+          <w:noProof/>
           <w:sz w:val="21"/>
           <w:szCs w:val="21"/>
         </w:rPr>
-        <w:t>Error! Bookmark not defined.</w:t>
+        <w:t>«TANGGAL_SURAT»</w:t>
       </w:r>
       <w:r>
         <w:rPr>
@@ -4200,6 +4219,243 @@
     </w:sectPr>
   </w:body>
 </w:document>
+</file>
+
+<file path=word/recipientData.xml><?xml version="1.0" encoding="utf-8"?>
+<wne:recipients xmlns:wpc="http://schemas.microsoft.com/office/word/2010/wordprocessingCanvas" xmlns:cx="http://schemas.microsoft.com/office/drawing/2014/chartex" xmlns:cx1="http://schemas.microsoft.com/office/drawing/2015/9/8/chartex" xmlns:cx2="http://schemas.microsoft.com/office/drawing/2015/10/21/chartex" xmlns:cx3="http://schemas.microsoft.com/office/drawing/2016/5/9/chartex" xmlns:cx4="http://schemas.microsoft.com/office/drawing/2016/5/10/chartex" xmlns:cx5="http://schemas.microsoft.com/office/drawing/2016/5/11/chartex" xmlns:cx6="http://schemas.microsoft.com/office/drawing/2016/5/12/chartex" xmlns:cx7="http://schemas.microsoft.com/office/drawing/2016/5/13/chartex" xmlns:cx8="http://schemas.microsoft.com/office/drawing/2016/5/14/chartex" xmlns:mc="http://schemas.openxmlformats.org/markup-compatibility/2006" xmlns:aink="http://schemas.microsoft.com/office/drawing/2016/ink" xmlns:am3d="http://schemas.microsoft.com/office/drawing/2017/model3d" xmlns:o="urn:schemas-microsoft-com:office:office" xmlns:oel="http://schemas.microsoft.com/office/2019/extlst" xmlns:r="http://schemas.openxmlformats.org/officeDocument/2006/relationships" xmlns:m="http://schemas.openxmlformats.org/officeDocument/2006/math" xmlns:v="urn:schemas-microsoft-com:vml" xmlns:wp14="http://schemas.microsoft.com/office/word/2010/wordprocessingDrawing" xmlns:wp="http://schemas.openxmlformats.org/drawingml/2006/wordprocessingDrawing" xmlns:w10="urn:schemas-microsoft-com:office:word" xmlns:w="http://schemas.openxmlformats.org/wordprocessingml/2006/main" xmlns:w14="http://schemas.microsoft.com/office/word/2010/wordml" xmlns:w15="http://schemas.microsoft.com/office/word/2012/wordml" xmlns:w16cex="http://schemas.microsoft.com/office/word/2018/wordml/cex" xmlns:w16cid="http://schemas.microsoft.com/office/word/2016/wordml/cid" xmlns:w16="http://schemas.microsoft.com/office/word/2018/wordml" xmlns:w16du="http://schemas.microsoft.com/office/word/2023/wordml/word16du" xmlns:w16sdtdh="http://schemas.microsoft.com/office/word/2020/wordml/sdtdatahash" xmlns:w16sdtfl="http://schemas.microsoft.com/office/word/2024/wordml/sdtformatlock" xmlns:w16se="http://schemas.microsoft.com/office/word/2015/wordml/symex" xmlns:wpg="http://schemas.microsoft.com/office/word/2010/wordprocessingGroup" xmlns:wpi="http://schemas.microsoft.com/office/word/2010/wordprocessingInk" xmlns:wne="http://schemas.microsoft.com/office/word/2006/wordml" xmlns:wps="http://schemas.microsoft.com/office/word/2010/wordprocessingShape" mc:Ignorable="w14 w15 w16se w16cid w16 w16cex w16sdtdh w16sdtfl w16du wp14">
+  <wne:recipientData>
+    <wne:active wne:val="0"/>
+    <wne:hash wne:val="498389280"/>
+  </wne:recipientData>
+  <wne:recipientData>
+    <wne:active wne:val="0"/>
+    <wne:hash wne:val="-2130662064"/>
+  </wne:recipientData>
+  <wne:recipientData>
+    <wne:active wne:val="0"/>
+    <wne:hash wne:val="-278933495"/>
+  </wne:recipientData>
+  <wne:recipientData>
+    <wne:active wne:val="0"/>
+    <wne:hash wne:val="843819320"/>
+  </wne:recipientData>
+  <wne:recipientData>
+    <wne:active wne:val="0"/>
+    <wne:hash wne:val="565531124"/>
+  </wne:recipientData>
+  <wne:recipientData>
+    <wne:active wne:val="0"/>
+    <wne:hash wne:val="1004954100"/>
+  </wne:recipientData>
+  <wne:recipientData>
+    <wne:active wne:val="0"/>
+    <wne:hash wne:val="-97054106"/>
+  </wne:recipientData>
+  <wne:recipientData>
+    <wne:active wne:val="0"/>
+    <wne:hash wne:val="524913485"/>
+  </wne:recipientData>
+  <wne:recipientData>
+    <wne:active wne:val="0"/>
+    <wne:hash wne:val="377963914"/>
+  </wne:recipientData>
+  <wne:recipientData>
+    <wne:active wne:val="0"/>
+    <wne:hash wne:val="-527344461"/>
+  </wne:recipientData>
+  <wne:recipientData>
+    <wne:active wne:val="0"/>
+    <wne:hash wne:val="1988058503"/>
+  </wne:recipientData>
+  <wne:recipientData>
+    <wne:active wne:val="0"/>
+    <wne:hash wne:val="-1202900448"/>
+  </wne:recipientData>
+  <wne:recipientData>
+    <wne:active wne:val="0"/>
+    <wne:hash wne:val="-834988673"/>
+  </wne:recipientData>
+  <wne:recipientData>
+    <wne:active wne:val="0"/>
+    <wne:hash wne:val="-1138480618"/>
+  </wne:recipientData>
+  <wne:recipientData>
+    <wne:active wne:val="0"/>
+    <wne:hash wne:val="-650276633"/>
+  </wne:recipientData>
+  <wne:recipientData>
+    <wne:active wne:val="0"/>
+    <wne:hash wne:val="757585704"/>
+  </wne:recipientData>
+  <wne:recipientData>
+    <wne:active wne:val="0"/>
+    <wne:hash wne:val="922720255"/>
+  </wne:recipientData>
+  <wne:recipientData>
+    <wne:active wne:val="0"/>
+    <wne:hash wne:val="1735228851"/>
+  </wne:recipientData>
+  <wne:recipientData>
+    <wne:active wne:val="0"/>
+    <wne:hash wne:val="1511747578"/>
+  </wne:recipientData>
+  <wne:recipientData>
+    <wne:active wne:val="0"/>
+    <wne:hash wne:val="-383922156"/>
+  </wne:recipientData>
+  <wne:recipientData>
+    <wne:active wne:val="0"/>
+    <wne:hash wne:val="1337629000"/>
+  </wne:recipientData>
+  <wne:recipientData>
+    <wne:active wne:val="0"/>
+    <wne:hash wne:val="2008342651"/>
+  </wne:recipientData>
+  <wne:recipientData>
+    <wne:active wne:val="0"/>
+    <wne:hash wne:val="-524788425"/>
+  </wne:recipientData>
+  <wne:recipientData>
+    <wne:active wne:val="0"/>
+    <wne:hash wne:val="1827781601"/>
+  </wne:recipientData>
+  <wne:recipientData>
+    <wne:active wne:val="0"/>
+    <wne:hash wne:val="1797401648"/>
+  </wne:recipientData>
+  <wne:recipientData>
+    <wne:active wne:val="0"/>
+    <wne:hash wne:val="-1373656624"/>
+  </wne:recipientData>
+  <wne:recipientData>
+    <wne:active wne:val="0"/>
+    <wne:hash wne:val="-1482150237"/>
+  </wne:recipientData>
+  <wne:recipientData>
+    <wne:active wne:val="0"/>
+    <wne:hash wne:val="24330634"/>
+  </wne:recipientData>
+  <wne:recipientData>
+    <wne:active wne:val="0"/>
+    <wne:hash wne:val="-235159263"/>
+  </wne:recipientData>
+  <wne:recipientData>
+    <wne:active wne:val="0"/>
+    <wne:hash wne:val="-606451415"/>
+  </wne:recipientData>
+  <wne:recipientData>
+    <wne:active wne:val="0"/>
+    <wne:hash wne:val="221204401"/>
+  </wne:recipientData>
+  <wne:recipientData>
+    <wne:active wne:val="0"/>
+    <wne:hash wne:val="115121412"/>
+  </wne:recipientData>
+  <wne:recipientData>
+    <wne:active wne:val="0"/>
+    <wne:hash wne:val="-1247239447"/>
+  </wne:recipientData>
+  <wne:recipientData>
+    <wne:active wne:val="0"/>
+    <wne:hash wne:val="342231599"/>
+  </wne:recipientData>
+  <wne:recipientData>
+    <wne:active wne:val="0"/>
+    <wne:hash wne:val="252921738"/>
+  </wne:recipientData>
+  <wne:recipientData>
+    <wne:active wne:val="0"/>
+    <wne:hash wne:val="768984595"/>
+  </wne:recipientData>
+  <wne:recipientData>
+    <wne:active wne:val="0"/>
+    <wne:hash wne:val="1825106394"/>
+  </wne:recipientData>
+  <wne:recipientData>
+    <wne:active wne:val="0"/>
+    <wne:hash wne:val="1064455070"/>
+  </wne:recipientData>
+  <wne:recipientData>
+    <wne:active wne:val="0"/>
+    <wne:hash wne:val="716069638"/>
+  </wne:recipientData>
+  <wne:recipientData>
+    <wne:active wne:val="0"/>
+    <wne:hash wne:val="-494834947"/>
+  </wne:recipientData>
+  <wne:recipientData>
+    <wne:active wne:val="1"/>
+    <wne:hash wne:val="-1722389032"/>
+  </wne:recipientData>
+  <wne:recipientData>
+    <wne:active wne:val="0"/>
+    <wne:hash wne:val="-643127856"/>
+  </wne:recipientData>
+  <wne:recipientData>
+    <wne:active wne:val="0"/>
+    <wne:hash wne:val="655142503"/>
+  </wne:recipientData>
+  <wne:recipientData>
+    <wne:active wne:val="0"/>
+    <wne:hash wne:val="-58154278"/>
+  </wne:recipientData>
+  <wne:recipientData>
+    <wne:active wne:val="0"/>
+    <wne:hash wne:val="585444623"/>
+  </wne:recipientData>
+  <wne:recipientData>
+    <wne:active wne:val="0"/>
+    <wne:hash wne:val="1964394082"/>
+  </wne:recipientData>
+  <wne:recipientData>
+    <wne:active wne:val="0"/>
+    <wne:hash wne:val="1499549670"/>
+  </wne:recipientData>
+  <wne:recipientData>
+    <wne:active wne:val="0"/>
+    <wne:hash wne:val="-913165267"/>
+  </wne:recipientData>
+  <wne:recipientData>
+    <wne:active wne:val="0"/>
+    <wne:hash wne:val="791909279"/>
+  </wne:recipientData>
+  <wne:recipientData>
+    <wne:active wne:val="0"/>
+    <wne:hash wne:val="-592255685"/>
+  </wne:recipientData>
+  <wne:recipientData>
+    <wne:active wne:val="0"/>
+    <wne:hash wne:val="1613698641"/>
+  </wne:recipientData>
+  <wne:recipientData>
+    <wne:active wne:val="0"/>
+    <wne:hash wne:val="-849892707"/>
+  </wne:recipientData>
+  <wne:recipientData>
+    <wne:active wne:val="0"/>
+    <wne:hash wne:val="1674034589"/>
+  </wne:recipientData>
+  <wne:recipientData>
+    <wne:active wne:val="0"/>
+    <wne:hash wne:val="92856483"/>
+  </wne:recipientData>
+  <wne:recipientData>
+    <wne:active wne:val="0"/>
+    <wne:hash wne:val="-1905118903"/>
+  </wne:recipientData>
+  <wne:recipientData>
+    <wne:active wne:val="0"/>
+    <wne:hash wne:val="149727436"/>
+  </wne:recipientData>
+  <wne:recipientData>
+    <wne:active wne:val="0"/>
+    <wne:hash wne:val="-1897217547"/>
+  </wne:recipientData>
+  <wne:recipientData>
+    <wne:active wne:val="0"/>
+    <wne:hash wne:val="-327022209"/>
+  </wne:recipientData>
+</wne:recipients>
 </file>
 
 <file path=word/styles.xml><?xml version="1.0" encoding="utf-8"?>

</xml_diff>

<commit_message>
Fix PP Test alignment and make PP Test result bold in template and generated output
</commit_message>
<xml_diff>
--- a/NEW TEMPLATE SAT URIN.docx
+++ b/NEW TEMPLATE SAT URIN.docx
@@ -3904,7 +3904,7 @@
                 <w:sz w:val="19"/>
                 <w:szCs w:val="19"/>
               </w:rPr>
-              <w:instrText xml:space="preserve"> MERG</w:instrText>
+              <w:instrText xml:space="preserve"> MERGEFIELD PP_TEST </w:instrText>
             </w:r>
             <w:r>
               <w:rPr>
@@ -3916,13 +3916,9 @@
                 <w:sz w:val="19"/>
                 <w:szCs w:val="19"/>
               </w:rPr>
-              <w:instrText>EFIELD</w:instrText>
-            </w:r>
-          </w:p>
-          <w:p>
-            <w:pPr>
-              <w:ind w:left="-126"/>
-              <w:jc w:val="center"/>
+              <w:fldChar w:fldCharType="separate"/>
+            </w:r>
+            <w:r>
               <w:rPr>
                 <w:rFonts w:ascii="Arial" w:eastAsia="Times New Roman" w:hAnsi="Arial" w:cs="Arial"/>
                 <w:b/>
@@ -3932,54 +3928,7 @@
                 <w:sz w:val="19"/>
                 <w:szCs w:val="19"/>
               </w:rPr>
-            </w:pPr>
-            <w:r>
-              <w:rPr>
-                <w:rFonts w:ascii="Arial" w:eastAsia="Times New Roman" w:hAnsi="Arial" w:cs="Arial"/>
-                <w:b/>
-                <w:bCs/>
-                <w:noProof/>
-                <w:color w:val="000000"/>
-                <w:sz w:val="19"/>
-                <w:szCs w:val="19"/>
-              </w:rPr>
-              <w:instrText>PP TEST</w:instrText>
-            </w:r>
-            <w:r>
-              <w:rPr>
-                <w:rFonts w:ascii="Arial" w:eastAsia="Times New Roman" w:hAnsi="Arial" w:cs="Arial"/>
-                <w:b/>
-                <w:bCs/>
-                <w:noProof/>
-                <w:color w:val="000000"/>
-                <w:sz w:val="19"/>
-                <w:szCs w:val="19"/>
-              </w:rPr>
-              <w:instrText xml:space="preserve"> </w:instrText>
-            </w:r>
-            <w:r>
-              <w:rPr>
-                <w:rFonts w:ascii="Arial" w:eastAsia="Times New Roman" w:hAnsi="Arial" w:cs="Arial"/>
-                <w:b/>
-                <w:bCs/>
-                <w:noProof/>
-                <w:color w:val="000000"/>
-                <w:sz w:val="19"/>
-                <w:szCs w:val="19"/>
-              </w:rPr>
-              <w:fldChar w:fldCharType="separate"/>
-            </w:r>
-            <w:r>
-              <w:rPr>
-                <w:rFonts w:ascii="Arial" w:eastAsia="Times New Roman" w:hAnsi="Arial" w:cs="Arial"/>
-                <w:b/>
-                <w:bCs/>
-                <w:noProof/>
-                <w:color w:val="000000"/>
-                <w:sz w:val="19"/>
-                <w:szCs w:val="19"/>
-              </w:rPr>
-              <w:t>«PP»</w:t>
+              <w:t>«PP_TEST»</w:t>
             </w:r>
             <w:r>
               <w:rPr>

</xml_diff>

<commit_message>
Support URINE sheet name and alternate NO column header in generation mode
</commit_message>
<xml_diff>
--- a/NEW TEMPLATE SAT URIN.docx
+++ b/NEW TEMPLATE SAT URIN.docx
@@ -3802,6 +3802,15 @@
                 <w:szCs w:val="20"/>
               </w:rPr>
             </w:pPr>
+            <w:r>
+              <w:rPr>
+                <w:rFonts w:ascii="Arial" w:eastAsia="Times New Roman" w:hAnsi="Arial" w:cs="Arial"/>
+                <w:color w:val="000000"/>
+                <w:sz w:val="20"/>
+                <w:szCs w:val="20"/>
+              </w:rPr>
+              <w:t>/LPB</w:t>
+            </w:r>
           </w:p>
         </w:tc>
         <w:tc>
@@ -4174,235 +4183,247 @@
 <wne:recipients xmlns:wpc="http://schemas.microsoft.com/office/word/2010/wordprocessingCanvas" xmlns:cx="http://schemas.microsoft.com/office/drawing/2014/chartex" xmlns:cx1="http://schemas.microsoft.com/office/drawing/2015/9/8/chartex" xmlns:cx2="http://schemas.microsoft.com/office/drawing/2015/10/21/chartex" xmlns:cx3="http://schemas.microsoft.com/office/drawing/2016/5/9/chartex" xmlns:cx4="http://schemas.microsoft.com/office/drawing/2016/5/10/chartex" xmlns:cx5="http://schemas.microsoft.com/office/drawing/2016/5/11/chartex" xmlns:cx6="http://schemas.microsoft.com/office/drawing/2016/5/12/chartex" xmlns:cx7="http://schemas.microsoft.com/office/drawing/2016/5/13/chartex" xmlns:cx8="http://schemas.microsoft.com/office/drawing/2016/5/14/chartex" xmlns:mc="http://schemas.openxmlformats.org/markup-compatibility/2006" xmlns:aink="http://schemas.microsoft.com/office/drawing/2016/ink" xmlns:am3d="http://schemas.microsoft.com/office/drawing/2017/model3d" xmlns:o="urn:schemas-microsoft-com:office:office" xmlns:oel="http://schemas.microsoft.com/office/2019/extlst" xmlns:r="http://schemas.openxmlformats.org/officeDocument/2006/relationships" xmlns:m="http://schemas.openxmlformats.org/officeDocument/2006/math" xmlns:v="urn:schemas-microsoft-com:vml" xmlns:wp14="http://schemas.microsoft.com/office/word/2010/wordprocessingDrawing" xmlns:wp="http://schemas.openxmlformats.org/drawingml/2006/wordprocessingDrawing" xmlns:w10="urn:schemas-microsoft-com:office:word" xmlns:w="http://schemas.openxmlformats.org/wordprocessingml/2006/main" xmlns:w14="http://schemas.microsoft.com/office/word/2010/wordml" xmlns:w15="http://schemas.microsoft.com/office/word/2012/wordml" xmlns:w16cex="http://schemas.microsoft.com/office/word/2018/wordml/cex" xmlns:w16cid="http://schemas.microsoft.com/office/word/2016/wordml/cid" xmlns:w16="http://schemas.microsoft.com/office/word/2018/wordml" xmlns:w16du="http://schemas.microsoft.com/office/word/2023/wordml/word16du" xmlns:w16sdtdh="http://schemas.microsoft.com/office/word/2020/wordml/sdtdatahash" xmlns:w16sdtfl="http://schemas.microsoft.com/office/word/2024/wordml/sdtformatlock" xmlns:w16se="http://schemas.microsoft.com/office/word/2015/wordml/symex" xmlns:wpg="http://schemas.microsoft.com/office/word/2010/wordprocessingGroup" xmlns:wpi="http://schemas.microsoft.com/office/word/2010/wordprocessingInk" xmlns:wne="http://schemas.microsoft.com/office/word/2006/wordml" xmlns:wps="http://schemas.microsoft.com/office/word/2010/wordprocessingShape" mc:Ignorable="w14 w15 w16se w16cid w16 w16cex w16sdtdh w16sdtfl w16du wp14">
   <wne:recipientData>
     <wne:active wne:val="0"/>
-    <wne:hash wne:val="498389280"/>
-  </wne:recipientData>
-  <wne:recipientData>
-    <wne:active wne:val="0"/>
-    <wne:hash wne:val="-2130662064"/>
-  </wne:recipientData>
-  <wne:recipientData>
-    <wne:active wne:val="0"/>
-    <wne:hash wne:val="-278933495"/>
-  </wne:recipientData>
-  <wne:recipientData>
-    <wne:active wne:val="0"/>
-    <wne:hash wne:val="843819320"/>
-  </wne:recipientData>
-  <wne:recipientData>
-    <wne:active wne:val="0"/>
-    <wne:hash wne:val="565531124"/>
-  </wne:recipientData>
-  <wne:recipientData>
-    <wne:active wne:val="0"/>
-    <wne:hash wne:val="1004954100"/>
-  </wne:recipientData>
-  <wne:recipientData>
-    <wne:active wne:val="0"/>
-    <wne:hash wne:val="-97054106"/>
-  </wne:recipientData>
-  <wne:recipientData>
-    <wne:active wne:val="0"/>
-    <wne:hash wne:val="524913485"/>
-  </wne:recipientData>
-  <wne:recipientData>
-    <wne:active wne:val="0"/>
-    <wne:hash wne:val="377963914"/>
-  </wne:recipientData>
-  <wne:recipientData>
-    <wne:active wne:val="0"/>
-    <wne:hash wne:val="-527344461"/>
-  </wne:recipientData>
-  <wne:recipientData>
-    <wne:active wne:val="0"/>
-    <wne:hash wne:val="1988058503"/>
-  </wne:recipientData>
-  <wne:recipientData>
-    <wne:active wne:val="0"/>
-    <wne:hash wne:val="-1202900448"/>
-  </wne:recipientData>
-  <wne:recipientData>
-    <wne:active wne:val="0"/>
-    <wne:hash wne:val="-834988673"/>
-  </wne:recipientData>
-  <wne:recipientData>
-    <wne:active wne:val="0"/>
-    <wne:hash wne:val="-1138480618"/>
-  </wne:recipientData>
-  <wne:recipientData>
-    <wne:active wne:val="0"/>
-    <wne:hash wne:val="-650276633"/>
-  </wne:recipientData>
-  <wne:recipientData>
-    <wne:active wne:val="0"/>
-    <wne:hash wne:val="757585704"/>
-  </wne:recipientData>
-  <wne:recipientData>
-    <wne:active wne:val="0"/>
-    <wne:hash wne:val="922720255"/>
-  </wne:recipientData>
-  <wne:recipientData>
-    <wne:active wne:val="0"/>
-    <wne:hash wne:val="1735228851"/>
-  </wne:recipientData>
-  <wne:recipientData>
-    <wne:active wne:val="0"/>
-    <wne:hash wne:val="1511747578"/>
-  </wne:recipientData>
-  <wne:recipientData>
-    <wne:active wne:val="0"/>
-    <wne:hash wne:val="-383922156"/>
-  </wne:recipientData>
-  <wne:recipientData>
-    <wne:active wne:val="0"/>
-    <wne:hash wne:val="1337629000"/>
-  </wne:recipientData>
-  <wne:recipientData>
-    <wne:active wne:val="0"/>
-    <wne:hash wne:val="2008342651"/>
-  </wne:recipientData>
-  <wne:recipientData>
-    <wne:active wne:val="0"/>
-    <wne:hash wne:val="-524788425"/>
-  </wne:recipientData>
-  <wne:recipientData>
-    <wne:active wne:val="0"/>
-    <wne:hash wne:val="1827781601"/>
-  </wne:recipientData>
-  <wne:recipientData>
-    <wne:active wne:val="0"/>
-    <wne:hash wne:val="1797401648"/>
-  </wne:recipientData>
-  <wne:recipientData>
-    <wne:active wne:val="0"/>
-    <wne:hash wne:val="-1373656624"/>
-  </wne:recipientData>
-  <wne:recipientData>
-    <wne:active wne:val="0"/>
-    <wne:hash wne:val="-1482150237"/>
-  </wne:recipientData>
-  <wne:recipientData>
-    <wne:active wne:val="0"/>
-    <wne:hash wne:val="24330634"/>
-  </wne:recipientData>
-  <wne:recipientData>
-    <wne:active wne:val="0"/>
-    <wne:hash wne:val="-235159263"/>
-  </wne:recipientData>
-  <wne:recipientData>
-    <wne:active wne:val="0"/>
-    <wne:hash wne:val="-606451415"/>
-  </wne:recipientData>
-  <wne:recipientData>
-    <wne:active wne:val="0"/>
-    <wne:hash wne:val="221204401"/>
-  </wne:recipientData>
-  <wne:recipientData>
-    <wne:active wne:val="0"/>
-    <wne:hash wne:val="115121412"/>
-  </wne:recipientData>
-  <wne:recipientData>
-    <wne:active wne:val="0"/>
-    <wne:hash wne:val="-1247239447"/>
-  </wne:recipientData>
-  <wne:recipientData>
-    <wne:active wne:val="0"/>
-    <wne:hash wne:val="342231599"/>
-  </wne:recipientData>
-  <wne:recipientData>
-    <wne:active wne:val="0"/>
-    <wne:hash wne:val="252921738"/>
-  </wne:recipientData>
-  <wne:recipientData>
-    <wne:active wne:val="0"/>
-    <wne:hash wne:val="768984595"/>
-  </wne:recipientData>
-  <wne:recipientData>
-    <wne:active wne:val="0"/>
-    <wne:hash wne:val="1825106394"/>
-  </wne:recipientData>
-  <wne:recipientData>
-    <wne:active wne:val="0"/>
-    <wne:hash wne:val="1064455070"/>
-  </wne:recipientData>
-  <wne:recipientData>
-    <wne:active wne:val="0"/>
-    <wne:hash wne:val="716069638"/>
-  </wne:recipientData>
-  <wne:recipientData>
-    <wne:active wne:val="0"/>
-    <wne:hash wne:val="-494834947"/>
+    <wne:hash wne:val="-1508588166"/>
+  </wne:recipientData>
+  <wne:recipientData>
+    <wne:active wne:val="0"/>
+    <wne:hash wne:val="992546064"/>
+  </wne:recipientData>
+  <wne:recipientData>
+    <wne:active wne:val="0"/>
+    <wne:hash wne:val="-2085930843"/>
+  </wne:recipientData>
+  <wne:recipientData>
+    <wne:active wne:val="0"/>
+    <wne:hash wne:val="-2072937152"/>
+  </wne:recipientData>
+  <wne:recipientData>
+    <wne:active wne:val="0"/>
+    <wne:hash wne:val="927016225"/>
+  </wne:recipientData>
+  <wne:recipientData>
+    <wne:active wne:val="0"/>
+    <wne:hash wne:val="-1737546199"/>
+  </wne:recipientData>
+  <wne:recipientData>
+    <wne:active wne:val="0"/>
+    <wne:hash wne:val="-667032795"/>
+  </wne:recipientData>
+  <wne:recipientData>
+    <wne:active wne:val="0"/>
+    <wne:hash wne:val="2085755161"/>
+  </wne:recipientData>
+  <wne:recipientData>
+    <wne:active wne:val="0"/>
+    <wne:hash wne:val="-660559763"/>
+  </wne:recipientData>
+  <wne:recipientData>
+    <wne:active wne:val="0"/>
+    <wne:hash wne:val="-984947388"/>
+  </wne:recipientData>
+  <wne:recipientData>
+    <wne:active wne:val="0"/>
+    <wne:hash wne:val="-888301806"/>
+  </wne:recipientData>
+  <wne:recipientData>
+    <wne:active wne:val="0"/>
+    <wne:hash wne:val="580826576"/>
+  </wne:recipientData>
+  <wne:recipientData>
+    <wne:active wne:val="0"/>
+    <wne:hash wne:val="-1134434151"/>
+  </wne:recipientData>
+  <wne:recipientData>
+    <wne:active wne:val="0"/>
+    <wne:hash wne:val="1526157565"/>
+  </wne:recipientData>
+  <wne:recipientData>
+    <wne:active wne:val="0"/>
+    <wne:hash wne:val="472084673"/>
+  </wne:recipientData>
+  <wne:recipientData>
+    <wne:active wne:val="0"/>
+    <wne:hash wne:val="-458893516"/>
+  </wne:recipientData>
+  <wne:recipientData>
+    <wne:active wne:val="0"/>
+    <wne:hash wne:val="-1598405971"/>
+  </wne:recipientData>
+  <wne:recipientData>
+    <wne:active wne:val="0"/>
+    <wne:hash wne:val="2059858816"/>
+  </wne:recipientData>
+  <wne:recipientData>
+    <wne:active wne:val="0"/>
+    <wne:hash wne:val="-661933289"/>
+  </wne:recipientData>
+  <wne:recipientData>
+    <wne:active wne:val="0"/>
+    <wne:hash wne:val="-549662617"/>
+  </wne:recipientData>
+  <wne:recipientData>
+    <wne:active wne:val="0"/>
+    <wne:hash wne:val="123126980"/>
+  </wne:recipientData>
+  <wne:recipientData>
+    <wne:active wne:val="0"/>
+    <wne:hash wne:val="-1220418621"/>
+  </wne:recipientData>
+  <wne:recipientData>
+    <wne:active wne:val="0"/>
+    <wne:hash wne:val="-1362080012"/>
+  </wne:recipientData>
+  <wne:recipientData>
+    <wne:active wne:val="0"/>
+    <wne:hash wne:val="1850601825"/>
+  </wne:recipientData>
+  <wne:recipientData>
+    <wne:active wne:val="0"/>
+    <wne:hash wne:val="1866441529"/>
+  </wne:recipientData>
+  <wne:recipientData>
+    <wne:active wne:val="0"/>
+    <wne:hash wne:val="-603714647"/>
+  </wne:recipientData>
+  <wne:recipientData>
+    <wne:active wne:val="0"/>
+    <wne:hash wne:val="-1804614031"/>
+  </wne:recipientData>
+  <wne:recipientData>
+    <wne:active wne:val="0"/>
+    <wne:hash wne:val="1002997926"/>
+  </wne:recipientData>
+  <wne:recipientData>
+    <wne:active wne:val="0"/>
+    <wne:hash wne:val="255038626"/>
+  </wne:recipientData>
+  <wne:recipientData>
+    <wne:active wne:val="0"/>
+    <wne:hash wne:val="-604816994"/>
+  </wne:recipientData>
+  <wne:recipientData>
+    <wne:active wne:val="0"/>
+    <wne:hash wne:val="-1827439185"/>
+  </wne:recipientData>
+  <wne:recipientData>
+    <wne:active wne:val="0"/>
+    <wne:hash wne:val="-1046135822"/>
+  </wne:recipientData>
+  <wne:recipientData>
+    <wne:active wne:val="0"/>
+    <wne:hash wne:val="-931429467"/>
+  </wne:recipientData>
+  <wne:recipientData>
+    <wne:active wne:val="0"/>
+    <wne:hash wne:val="1555335994"/>
+  </wne:recipientData>
+  <wne:recipientData>
+    <wne:active wne:val="0"/>
+    <wne:hash wne:val="-7587991"/>
+  </wne:recipientData>
+  <wne:recipientData>
+    <wne:active wne:val="0"/>
+    <wne:hash wne:val="-1332935312"/>
+  </wne:recipientData>
+  <wne:recipientData>
+    <wne:active wne:val="0"/>
+    <wne:hash wne:val="-142125892"/>
+  </wne:recipientData>
+  <wne:recipientData>
+    <wne:active wne:val="0"/>
+    <wne:hash wne:val="635483831"/>
+  </wne:recipientData>
+  <wne:recipientData>
+    <wne:active wne:val="0"/>
+    <wne:hash wne:val="1059491036"/>
+  </wne:recipientData>
+  <wne:recipientData>
+    <wne:active wne:val="0"/>
+    <wne:hash wne:val="-342051031"/>
+  </wne:recipientData>
+  <wne:recipientData>
+    <wne:active wne:val="0"/>
+    <wne:hash wne:val="-489309553"/>
+  </wne:recipientData>
+  <wne:recipientData>
+    <wne:active wne:val="0"/>
+    <wne:hash wne:val="-1580047084"/>
+  </wne:recipientData>
+  <wne:recipientData>
+    <wne:active wne:val="0"/>
+    <wne:hash wne:val="1861532698"/>
+  </wne:recipientData>
+  <wne:recipientData>
+    <wne:active wne:val="0"/>
+    <wne:hash wne:val="-1351363298"/>
+  </wne:recipientData>
+  <wne:recipientData>
+    <wne:active wne:val="0"/>
+    <wne:hash wne:val="1300597811"/>
+  </wne:recipientData>
+  <wne:recipientData>
+    <wne:active wne:val="0"/>
+    <wne:hash wne:val="1099182312"/>
+  </wne:recipientData>
+  <wne:recipientData>
+    <wne:active wne:val="0"/>
+    <wne:hash wne:val="-1052796977"/>
   </wne:recipientData>
   <wne:recipientData>
     <wne:active wne:val="1"/>
-    <wne:hash wne:val="-1722389032"/>
-  </wne:recipientData>
-  <wne:recipientData>
-    <wne:active wne:val="0"/>
-    <wne:hash wne:val="-643127856"/>
-  </wne:recipientData>
-  <wne:recipientData>
-    <wne:active wne:val="0"/>
-    <wne:hash wne:val="655142503"/>
-  </wne:recipientData>
-  <wne:recipientData>
-    <wne:active wne:val="0"/>
-    <wne:hash wne:val="-58154278"/>
-  </wne:recipientData>
-  <wne:recipientData>
-    <wne:active wne:val="0"/>
-    <wne:hash wne:val="585444623"/>
-  </wne:recipientData>
-  <wne:recipientData>
-    <wne:active wne:val="0"/>
-    <wne:hash wne:val="1964394082"/>
-  </wne:recipientData>
-  <wne:recipientData>
-    <wne:active wne:val="0"/>
-    <wne:hash wne:val="1499549670"/>
-  </wne:recipientData>
-  <wne:recipientData>
-    <wne:active wne:val="0"/>
-    <wne:hash wne:val="-913165267"/>
-  </wne:recipientData>
-  <wne:recipientData>
-    <wne:active wne:val="0"/>
-    <wne:hash wne:val="791909279"/>
-  </wne:recipientData>
-  <wne:recipientData>
-    <wne:active wne:val="0"/>
-    <wne:hash wne:val="-592255685"/>
-  </wne:recipientData>
-  <wne:recipientData>
-    <wne:active wne:val="0"/>
-    <wne:hash wne:val="1613698641"/>
-  </wne:recipientData>
-  <wne:recipientData>
-    <wne:active wne:val="0"/>
-    <wne:hash wne:val="-849892707"/>
-  </wne:recipientData>
-  <wne:recipientData>
-    <wne:active wne:val="0"/>
-    <wne:hash wne:val="1674034589"/>
-  </wne:recipientData>
-  <wne:recipientData>
-    <wne:active wne:val="0"/>
-    <wne:hash wne:val="92856483"/>
-  </wne:recipientData>
-  <wne:recipientData>
-    <wne:active wne:val="0"/>
-    <wne:hash wne:val="-1905118903"/>
-  </wne:recipientData>
-  <wne:recipientData>
-    <wne:active wne:val="0"/>
-    <wne:hash wne:val="149727436"/>
-  </wne:recipientData>
-  <wne:recipientData>
-    <wne:active wne:val="0"/>
-    <wne:hash wne:val="-1897217547"/>
-  </wne:recipientData>
-  <wne:recipientData>
-    <wne:active wne:val="0"/>
-    <wne:hash wne:val="-327022209"/>
+    <wne:hash wne:val="-359041222"/>
+  </wne:recipientData>
+  <wne:recipientData>
+    <wne:active wne:val="0"/>
+    <wne:hash wne:val="-1257708978"/>
+  </wne:recipientData>
+  <wne:recipientData>
+    <wne:active wne:val="0"/>
+    <wne:hash wne:val="1719615103"/>
+  </wne:recipientData>
+  <wne:recipientData>
+    <wne:active wne:val="0"/>
+    <wne:hash wne:val="1107749042"/>
+  </wne:recipientData>
+  <wne:recipientData>
+    <wne:active wne:val="0"/>
+    <wne:hash wne:val="-701146722"/>
+  </wne:recipientData>
+  <wne:recipientData>
+    <wne:active wne:val="0"/>
+    <wne:hash wne:val="-1880673885"/>
+  </wne:recipientData>
+  <wne:recipientData>
+    <wne:active wne:val="0"/>
+    <wne:hash wne:val="-351809294"/>
+  </wne:recipientData>
+  <wne:recipientData>
+    <wne:active wne:val="0"/>
+    <wne:hash wne:val="861826067"/>
+  </wne:recipientData>
+  <wne:recipientData>
+    <wne:active wne:val="0"/>
+    <wne:hash wne:val="1507748056"/>
+  </wne:recipientData>
+  <wne:recipientData>
+    <wne:active wne:val="0"/>
+    <wne:hash wne:val="-1463417167"/>
+  </wne:recipientData>
+  <wne:recipientData>
+    <wne:active wne:val="0"/>
+    <wne:hash wne:val="1388196809"/>
+  </wne:recipientData>
+  <wne:recipientData>
+    <wne:active wne:val="0"/>
+    <wne:hash wne:val="626930627"/>
+  </wne:recipientData>
+  <wne:recipientData>
+    <wne:active wne:val="0"/>
+    <wne:hash wne:val="-1954218635"/>
+  </wne:recipientData>
+  <wne:recipientData>
+    <wne:active wne:val="0"/>
+    <wne:hash wne:val="-1674521064"/>
   </wne:recipientData>
 </wne:recipients>
 </file>

</xml_diff>